<commit_message>
Fix integral domains and native Word conversion of complex formulas
</commit_message>
<xml_diff>
--- a/mathpdf_docx/output/2023_fan_editable.docx
+++ b/mathpdf_docx/output/2023_fan_editable.docx
@@ -8944,19 +8944,11 @@
       </w:r>
       <w:r>
         <w:rPr>
-          <w:rFonts w:ascii="Times New Roman" w:hAnsi="Times New Roman"/>
-          <w:b w:val="0"/>
-          <w:sz w:val="24"/>
-        </w:rPr>
-        <w:t xml:space="preserve"> </w:t>
-      </w:r>
-      <w:r>
-        <w:rPr>
           <w:position w:val="-12"/>
         </w:rPr>
         <w:drawing>
           <wp:inline xmlns:a="http://schemas.openxmlformats.org/drawingml/2006/main" xmlns:pic="http://schemas.openxmlformats.org/drawingml/2006/picture">
-            <wp:extent cx="704910" cy="333336"/>
+            <wp:extent cx="793567" cy="333336"/>
             <wp:docPr id="75" name="Picture 75" descr="Формула из PDF, не редактируется"/>
             <wp:cNvGraphicFramePr>
               <a:graphicFrameLocks noChangeAspect="1"/>
@@ -8977,7 +8969,7 @@
                   <pic:spPr>
                     <a:xfrm>
                       <a:off x="0" y="0"/>
-                      <a:ext cx="704910" cy="333336"/>
+                      <a:ext cx="793567" cy="333336"/>
                     </a:xfrm>
                     <a:prstGeom prst="rect"/>
                   </pic:spPr>
@@ -8990,19 +8982,6 @@
     </w:p>
     <w:p>
       <w:pPr>
-        <w:ind w:left="613"/>
-      </w:pPr>
-      <w:r>
-        <w:rPr>
-          <w:rFonts w:ascii="Times New Roman" w:hAnsi="Times New Roman"/>
-          <w:b w:val="0"/>
-          <w:sz w:val="15"/>
-        </w:rPr>
-        <w:t>[</w:t>
-      </w:r>
-    </w:p>
-    <w:p>
-      <w:pPr>
         <w:ind w:left="350"/>
       </w:pPr>
       <w:r>
@@ -9015,19 +8994,11 @@
       </w:r>
       <w:r>
         <w:rPr>
-          <w:rFonts w:ascii="Times New Roman" w:hAnsi="Times New Roman"/>
-          <w:b w:val="0"/>
-          <w:sz w:val="24"/>
-        </w:rPr>
-        <w:t xml:space="preserve"> </w:t>
-      </w:r>
-      <w:r>
-        <w:rPr>
           <w:position w:val="-11"/>
         </w:rPr>
         <w:drawing>
           <wp:inline xmlns:a="http://schemas.openxmlformats.org/drawingml/2006/main" xmlns:pic="http://schemas.openxmlformats.org/drawingml/2006/picture">
-            <wp:extent cx="1324167" cy="323807"/>
+            <wp:extent cx="1396283" cy="323807"/>
             <wp:docPr id="76" name="Picture 76" descr="Формула из PDF, не редактируется"/>
             <wp:cNvGraphicFramePr>
               <a:graphicFrameLocks noChangeAspect="1"/>
@@ -9048,7 +9019,7 @@
                   <pic:spPr>
                     <a:xfrm>
                       <a:off x="0" y="0"/>
-                      <a:ext cx="1324167" cy="323807"/>
+                      <a:ext cx="1396283" cy="323807"/>
                     </a:xfrm>
                     <a:prstGeom prst="rect"/>
                   </pic:spPr>
@@ -9061,19 +9032,6 @@
     </w:p>
     <w:p>
       <w:pPr>
-        <w:ind w:left="613"/>
-      </w:pPr>
-      <w:r>
-        <w:rPr>
-          <w:rFonts w:ascii="Times New Roman" w:hAnsi="Times New Roman"/>
-          <w:b w:val="0"/>
-          <w:sz w:val="15"/>
-        </w:rPr>
-        <w:t>[</w:t>
-      </w:r>
-    </w:p>
-    <w:p>
-      <w:pPr>
         <w:ind w:left="350"/>
       </w:pPr>
       <w:r>
@@ -9086,19 +9044,11 @@
       </w:r>
       <w:r>
         <w:rPr>
-          <w:rFonts w:ascii="Times New Roman" w:hAnsi="Times New Roman"/>
-          <w:b w:val="0"/>
-          <w:sz w:val="24"/>
-        </w:rPr>
-        <w:t xml:space="preserve"> </w:t>
-      </w:r>
-      <w:r>
-        <w:rPr>
           <w:position w:val="-11"/>
         </w:rPr>
         <w:drawing>
           <wp:inline xmlns:a="http://schemas.openxmlformats.org/drawingml/2006/main" xmlns:pic="http://schemas.openxmlformats.org/drawingml/2006/picture">
-            <wp:extent cx="1937561" cy="321691"/>
+            <wp:extent cx="1979112" cy="321691"/>
             <wp:docPr id="77" name="Picture 77" descr="Формула из PDF, не редактируется"/>
             <wp:cNvGraphicFramePr>
               <a:graphicFrameLocks noChangeAspect="1"/>
@@ -9119,7 +9069,7 @@
                   <pic:spPr>
                     <a:xfrm>
                       <a:off x="0" y="0"/>
-                      <a:ext cx="1937561" cy="321691"/>
+                      <a:ext cx="1979112" cy="321691"/>
                     </a:xfrm>
                     <a:prstGeom prst="rect"/>
                   </pic:spPr>
@@ -9143,17 +9093,9 @@
         <w:t>г)</w:t>
       </w:r>
       <w:r>
-        <w:rPr>
-          <w:rFonts w:ascii="Times New Roman" w:hAnsi="Times New Roman"/>
-          <w:b w:val="0"/>
-          <w:sz w:val="24"/>
-        </w:rPr>
-        <w:t xml:space="preserve"> </w:t>
-      </w:r>
-      <w:r>
         <w:drawing>
           <wp:inline xmlns:a="http://schemas.openxmlformats.org/drawingml/2006/main" xmlns:pic="http://schemas.openxmlformats.org/drawingml/2006/picture">
-            <wp:extent cx="1962727" cy="423278"/>
+            <wp:extent cx="2020755" cy="423278"/>
             <wp:docPr id="78" name="Picture 78" descr="Формула из PDF, не редактируется"/>
             <wp:cNvGraphicFramePr>
               <a:graphicFrameLocks noChangeAspect="1"/>
@@ -9174,7 +9116,7 @@
                   <pic:spPr>
                     <a:xfrm>
                       <a:off x="0" y="0"/>
-                      <a:ext cx="1962727" cy="423278"/>
+                      <a:ext cx="2020755" cy="423278"/>
                     </a:xfrm>
                     <a:prstGeom prst="rect"/>
                   </pic:spPr>
@@ -9187,19 +9129,6 @@
     </w:p>
     <w:p>
       <w:pPr>
-        <w:ind w:left="600"/>
-      </w:pPr>
-      <w:r>
-        <w:rPr>
-          <w:rFonts w:ascii="Times New Roman" w:hAnsi="Times New Roman"/>
-          <w:b w:val="0"/>
-          <w:sz w:val="15"/>
-        </w:rPr>
-        <w:t>[</w:t>
-      </w:r>
-    </w:p>
-    <w:p>
-      <w:pPr>
         <w:ind w:left="350"/>
       </w:pPr>
       <w:r>
@@ -9212,19 +9141,11 @@
       </w:r>
       <w:r>
         <w:rPr>
-          <w:rFonts w:ascii="Times New Roman" w:hAnsi="Times New Roman"/>
-          <w:b w:val="0"/>
-          <w:sz w:val="24"/>
-        </w:rPr>
-        <w:t xml:space="preserve"> </w:t>
-      </w:r>
-      <w:r>
-        <w:rPr>
           <w:position w:val="-12"/>
         </w:rPr>
         <w:drawing>
           <wp:inline xmlns:a="http://schemas.openxmlformats.org/drawingml/2006/main" xmlns:pic="http://schemas.openxmlformats.org/drawingml/2006/picture">
-            <wp:extent cx="713081" cy="336921"/>
+            <wp:extent cx="809429" cy="336921"/>
             <wp:docPr id="79" name="Picture 79" descr="Формула из PDF, не редактируется"/>
             <wp:cNvGraphicFramePr>
               <a:graphicFrameLocks noChangeAspect="1"/>
@@ -9245,7 +9166,7 @@
                   <pic:spPr>
                     <a:xfrm>
                       <a:off x="0" y="0"/>
-                      <a:ext cx="713081" cy="336921"/>
+                      <a:ext cx="809429" cy="336921"/>
                     </a:xfrm>
                     <a:prstGeom prst="rect"/>
                   </pic:spPr>
@@ -9258,19 +9179,6 @@
     </w:p>
     <w:p>
       <w:pPr>
-        <w:ind w:left="626"/>
-      </w:pPr>
-      <w:r>
-        <w:rPr>
-          <w:rFonts w:ascii="Times New Roman" w:hAnsi="Times New Roman"/>
-          <w:b w:val="0"/>
-          <w:sz w:val="15"/>
-        </w:rPr>
-        <w:t>[0</w:t>
-      </w:r>
-    </w:p>
-    <w:p>
-      <w:pPr>
         <w:ind w:left="350"/>
       </w:pPr>
       <w:r>
@@ -9283,19 +9191,11 @@
       </w:r>
       <w:r>
         <w:rPr>
-          <w:rFonts w:ascii="Times New Roman" w:hAnsi="Times New Roman"/>
-          <w:b w:val="0"/>
-          <w:sz w:val="24"/>
-        </w:rPr>
-        <w:t xml:space="preserve"> </w:t>
-      </w:r>
-      <w:r>
-        <w:rPr>
-          <w:position w:val="-8"/>
+          <w:position w:val="-12"/>
         </w:rPr>
         <w:drawing>
           <wp:inline xmlns:a="http://schemas.openxmlformats.org/drawingml/2006/main" xmlns:pic="http://schemas.openxmlformats.org/drawingml/2006/picture">
-            <wp:extent cx="742692" cy="232389"/>
+            <wp:extent cx="819234" cy="338376"/>
             <wp:docPr id="80" name="Picture 80" descr="Формула из PDF, не редактируется"/>
             <wp:cNvGraphicFramePr>
               <a:graphicFrameLocks noChangeAspect="1"/>
@@ -9316,7 +9216,7 @@
                   <pic:spPr>
                     <a:xfrm>
                       <a:off x="0" y="0"/>
-                      <a:ext cx="742692" cy="232389"/>
+                      <a:ext cx="819234" cy="338376"/>
                     </a:xfrm>
                     <a:prstGeom prst="rect"/>
                   </pic:spPr>
@@ -9371,19 +9271,6 @@
     </w:p>
     <w:p>
       <w:pPr>
-        <w:ind w:left="600"/>
-      </w:pPr>
-      <w:r>
-        <w:rPr>
-          <w:rFonts w:ascii="Times New Roman" w:hAnsi="Times New Roman"/>
-          <w:b w:val="0"/>
-          <w:sz w:val="15"/>
-        </w:rPr>
-        <w:t>[</w:t>
-      </w:r>
-    </w:p>
-    <w:p>
-      <w:pPr>
         <w:ind w:left="0"/>
       </w:pPr>
       <w:r>
@@ -9499,19 +9386,11 @@
       </w:r>
       <w:r>
         <w:rPr>
-          <w:rFonts w:ascii="Times New Roman" w:hAnsi="Times New Roman"/>
-          <w:b w:val="0"/>
-          <w:sz w:val="24"/>
-        </w:rPr>
-        <w:t xml:space="preserve"> </w:t>
-      </w:r>
-      <w:r>
-        <w:rPr>
           <w:position w:val="-12"/>
         </w:rPr>
         <w:drawing>
           <wp:inline xmlns:a="http://schemas.openxmlformats.org/drawingml/2006/main" xmlns:pic="http://schemas.openxmlformats.org/drawingml/2006/picture">
-            <wp:extent cx="631992" cy="339366"/>
+            <wp:extent cx="688559" cy="339366"/>
             <wp:docPr id="83" name="Picture 83" descr="Формула из PDF, не редактируется"/>
             <wp:cNvGraphicFramePr>
               <a:graphicFrameLocks noChangeAspect="1"/>
@@ -9532,7 +9411,7 @@
                   <pic:spPr>
                     <a:xfrm>
                       <a:off x="0" y="0"/>
-                      <a:ext cx="631992" cy="339366"/>
+                      <a:ext cx="688559" cy="339366"/>
                     </a:xfrm>
                     <a:prstGeom prst="rect"/>
                   </pic:spPr>
@@ -9541,19 +9420,6 @@
             </a:graphic>
           </wp:inline>
         </w:drawing>
-      </w:r>
-    </w:p>
-    <w:p>
-      <w:pPr>
-        <w:ind w:left="613"/>
-      </w:pPr>
-      <w:r>
-        <w:rPr>
-          <w:rFonts w:ascii="Times New Roman" w:hAnsi="Times New Roman"/>
-          <w:b w:val="0"/>
-          <w:sz w:val="15"/>
-        </w:rPr>
-        <w:t>[</w:t>
       </w:r>
     </w:p>
     <w:p>
@@ -9628,19 +9494,11 @@
       </w:r>
       <w:r>
         <w:rPr>
-          <w:rFonts w:ascii="Times New Roman" w:hAnsi="Times New Roman"/>
-          <w:b w:val="0"/>
-          <w:sz w:val="24"/>
-        </w:rPr>
-        <w:t xml:space="preserve"> </w:t>
-      </w:r>
-      <w:r>
-        <w:rPr>
           <w:position w:val="-11"/>
         </w:rPr>
         <w:drawing>
           <wp:inline xmlns:a="http://schemas.openxmlformats.org/drawingml/2006/main" xmlns:pic="http://schemas.openxmlformats.org/drawingml/2006/picture">
-            <wp:extent cx="645077" cy="321691"/>
+            <wp:extent cx="680765" cy="321691"/>
             <wp:docPr id="85" name="Picture 85" descr="Формула из PDF, не редактируется"/>
             <wp:cNvGraphicFramePr>
               <a:graphicFrameLocks noChangeAspect="1"/>
@@ -9661,7 +9519,7 @@
                   <pic:spPr>
                     <a:xfrm>
                       <a:off x="0" y="0"/>
-                      <a:ext cx="645077" cy="321691"/>
+                      <a:ext cx="680765" cy="321691"/>
                     </a:xfrm>
                     <a:prstGeom prst="rect"/>
                   </pic:spPr>
@@ -9686,19 +9544,11 @@
       </w:r>
       <w:r>
         <w:rPr>
-          <w:rFonts w:ascii="Times New Roman" w:hAnsi="Times New Roman"/>
-          <w:b w:val="0"/>
-          <w:sz w:val="24"/>
-        </w:rPr>
-        <w:t xml:space="preserve"> </w:t>
-      </w:r>
-      <w:r>
-        <w:rPr>
           <w:position w:val="-11"/>
         </w:rPr>
         <w:drawing>
           <wp:inline xmlns:a="http://schemas.openxmlformats.org/drawingml/2006/main" xmlns:pic="http://schemas.openxmlformats.org/drawingml/2006/picture">
-            <wp:extent cx="1285007" cy="323807"/>
+            <wp:extent cx="1328885" cy="323807"/>
             <wp:docPr id="86" name="Picture 86" descr="Формула из PDF, не редактируется"/>
             <wp:cNvGraphicFramePr>
               <a:graphicFrameLocks noChangeAspect="1"/>
@@ -9719,7 +9569,7 @@
                   <pic:spPr>
                     <a:xfrm>
                       <a:off x="0" y="0"/>
-                      <a:ext cx="1285007" cy="323807"/>
+                      <a:ext cx="1328885" cy="323807"/>
                     </a:xfrm>
                     <a:prstGeom prst="rect"/>
                   </pic:spPr>
@@ -9732,19 +9582,6 @@
     </w:p>
     <w:p>
       <w:pPr>
-        <w:ind w:left="600"/>
-      </w:pPr>
-      <w:r>
-        <w:rPr>
-          <w:rFonts w:ascii="Times New Roman" w:hAnsi="Times New Roman"/>
-          <w:b w:val="0"/>
-          <w:sz w:val="15"/>
-        </w:rPr>
-        <w:t>[</w:t>
-      </w:r>
-    </w:p>
-    <w:p>
-      <w:pPr>
         <w:ind w:left="350"/>
       </w:pPr>
       <w:r>
@@ -9757,19 +9594,11 @@
       </w:r>
       <w:r>
         <w:rPr>
-          <w:rFonts w:ascii="Times New Roman" w:hAnsi="Times New Roman"/>
-          <w:b w:val="0"/>
-          <w:sz w:val="24"/>
-        </w:rPr>
-        <w:t xml:space="preserve"> </w:t>
-      </w:r>
-      <w:r>
-        <w:rPr>
           <w:position w:val="-11"/>
         </w:rPr>
         <w:drawing>
           <wp:inline xmlns:a="http://schemas.openxmlformats.org/drawingml/2006/main" xmlns:pic="http://schemas.openxmlformats.org/drawingml/2006/picture">
-            <wp:extent cx="1310714" cy="323665"/>
+            <wp:extent cx="1328885" cy="323665"/>
             <wp:docPr id="87" name="Picture 87" descr="Формула из PDF, не редактируется"/>
             <wp:cNvGraphicFramePr>
               <a:graphicFrameLocks noChangeAspect="1"/>
@@ -9790,7 +9619,7 @@
                   <pic:spPr>
                     <a:xfrm>
                       <a:off x="0" y="0"/>
-                      <a:ext cx="1310714" cy="323665"/>
+                      <a:ext cx="1328885" cy="323665"/>
                     </a:xfrm>
                     <a:prstGeom prst="rect"/>
                   </pic:spPr>
@@ -9815,19 +9644,11 @@
       </w:r>
       <w:r>
         <w:rPr>
-          <w:rFonts w:ascii="Times New Roman" w:hAnsi="Times New Roman"/>
-          <w:b w:val="0"/>
-          <w:sz w:val="24"/>
-        </w:rPr>
-        <w:t xml:space="preserve"> </w:t>
-      </w:r>
-      <w:r>
-        <w:rPr>
-          <w:position w:val="-7"/>
+          <w:position w:val="-11"/>
         </w:rPr>
         <w:drawing>
           <wp:inline xmlns:a="http://schemas.openxmlformats.org/drawingml/2006/main" xmlns:pic="http://schemas.openxmlformats.org/drawingml/2006/picture">
-            <wp:extent cx="811936" cy="209934"/>
+            <wp:extent cx="860369" cy="314757"/>
             <wp:docPr id="88" name="Picture 88" descr="Формула из PDF, не редактируется"/>
             <wp:cNvGraphicFramePr>
               <a:graphicFrameLocks noChangeAspect="1"/>
@@ -9848,7 +9669,7 @@
                   <pic:spPr>
                     <a:xfrm>
                       <a:off x="0" y="0"/>
-                      <a:ext cx="811936" cy="209934"/>
+                      <a:ext cx="860369" cy="314757"/>
                     </a:xfrm>
                     <a:prstGeom prst="rect"/>
                   </pic:spPr>
@@ -10003,19 +9824,6 @@
           <w:sz w:val="24"/>
         </w:rPr>
         <w:t xml:space="preserve"> множество.</w:t>
-      </w:r>
-    </w:p>
-    <w:p>
-      <w:pPr>
-        <w:ind w:left="600"/>
-      </w:pPr>
-      <w:r>
-        <w:rPr>
-          <w:rFonts w:ascii="Times New Roman" w:hAnsi="Times New Roman"/>
-          <w:b w:val="0"/>
-          <w:sz w:val="15"/>
-        </w:rPr>
-        <w:t>[</w:t>
       </w:r>
     </w:p>
     <w:p>

</xml_diff>

<commit_message>
Preserve numero signs, formula boundary spaces and simple PDF math
</commit_message>
<xml_diff>
--- a/mathpdf_docx/output/2023_fan_editable.docx
+++ b/mathpdf_docx/output/2023_fan_editable.docx
@@ -6,7 +6,8 @@
       <w:pPr>
         <w:pStyle w:val="Heading2"/>
         <w:keepNext/>
-        <w:ind w:left="762"/>
+        <w:ind w:left="0"/>
+        <w:jc w:val="center"/>
       </w:pPr>
       <w:r>
         <w:rPr>
@@ -417,7 +418,8 @@
       <w:pPr>
         <w:pStyle w:val="Heading2"/>
         <w:keepNext/>
-        <w:ind w:left="1300"/>
+        <w:ind w:left="0"/>
+        <w:jc w:val="center"/>
       </w:pPr>
       <w:r>
         <w:rPr>
@@ -1040,6 +1042,14 @@
       </w:r>
       <w:r>
         <w:rPr>
+          <w:rFonts w:ascii="Times New Roman" w:hAnsi="Times New Roman"/>
+          <w:b w:val="0"/>
+          <w:sz w:val="24"/>
+        </w:rPr>
+        <w:t xml:space="preserve"> </w:t>
+      </w:r>
+      <w:r>
+        <w:rPr>
           <w:position w:val="-7"/>
         </w:rPr>
         <w:drawing>
@@ -1472,6 +1482,14 @@
       </w:r>
       <w:r>
         <w:rPr>
+          <w:rFonts w:ascii="Times New Roman" w:hAnsi="Times New Roman"/>
+          <w:b w:val="0"/>
+          <w:sz w:val="24"/>
+        </w:rPr>
+        <w:t xml:space="preserve"> </w:t>
+      </w:r>
+      <w:r>
+        <w:rPr>
           <w:position w:val="-5"/>
         </w:rPr>
         <w:drawing>
@@ -2584,6 +2602,14 @@
       </w:r>
       <w:r>
         <w:rPr>
+          <w:rFonts w:ascii="Times New Roman" w:hAnsi="Times New Roman"/>
+          <w:b w:val="0"/>
+          <w:sz w:val="24"/>
+        </w:rPr>
+        <w:t xml:space="preserve"> </w:t>
+      </w:r>
+      <w:r>
+        <w:rPr>
           <w:position w:val="-5"/>
         </w:rPr>
         <w:drawing>
@@ -2807,6 +2833,14 @@
       </w:r>
       <w:r>
         <w:rPr>
+          <w:rFonts w:ascii="Times New Roman" w:hAnsi="Times New Roman"/>
+          <w:b w:val="0"/>
+          <w:sz w:val="24"/>
+        </w:rPr>
+        <w:t xml:space="preserve"> </w:t>
+      </w:r>
+      <w:r>
+        <w:rPr>
           <w:position w:val="-6"/>
         </w:rPr>
         <w:drawing>
@@ -3020,7 +3054,8 @@
       <w:pPr>
         <w:pStyle w:val="Heading2"/>
         <w:keepNext/>
-        <w:ind w:left="1300"/>
+        <w:ind w:left="0"/>
+        <w:jc w:val="center"/>
       </w:pPr>
       <w:r>
         <w:rPr>
@@ -3430,9 +3465,9 @@
         <w:rPr>
           <w:rFonts w:ascii="Times New Roman" w:hAnsi="Times New Roman"/>
           <w:b w:val="0"/>
-          <w:sz w:val="23"/>
-        </w:rPr>
-        <w:t>в</w:t>
+          <w:sz w:val="24"/>
+        </w:rPr>
+        <w:t xml:space="preserve"> в</w:t>
       </w:r>
       <w:r>
         <w:rPr>
@@ -3728,6 +3763,14 @@
       </w:r>
       <w:r>
         <w:rPr>
+          <w:rFonts w:ascii="Times New Roman" w:hAnsi="Times New Roman"/>
+          <w:b w:val="0"/>
+          <w:sz w:val="24"/>
+        </w:rPr>
+        <w:t xml:space="preserve"> </w:t>
+      </w:r>
+      <w:r>
+        <w:rPr>
           <w:position w:val="-7"/>
         </w:rPr>
         <w:drawing>
@@ -3810,6 +3853,14 @@
       </w:r>
       <w:r>
         <w:rPr>
+          <w:rFonts w:ascii="Times New Roman" w:hAnsi="Times New Roman"/>
+          <w:b w:val="0"/>
+          <w:sz w:val="24"/>
+        </w:rPr>
+        <w:t xml:space="preserve"> </w:t>
+      </w:r>
+      <w:r>
+        <w:rPr>
           <w:position w:val="-7"/>
         </w:rPr>
         <w:drawing>
@@ -3855,6 +3906,14 @@
       </w:r>
       <w:r>
         <w:rPr>
+          <w:rFonts w:ascii="Times New Roman" w:hAnsi="Times New Roman"/>
+          <w:b w:val="0"/>
+          <w:sz w:val="24"/>
+        </w:rPr>
+        <w:t xml:space="preserve"> </w:t>
+      </w:r>
+      <w:r>
+        <w:rPr>
           <w:position w:val="-8"/>
         </w:rPr>
         <w:drawing>
@@ -4148,6 +4207,14 @@
       </w:r>
       <w:r>
         <w:rPr>
+          <w:rFonts w:ascii="Times New Roman" w:hAnsi="Times New Roman"/>
+          <w:b w:val="0"/>
+          <w:sz w:val="24"/>
+        </w:rPr>
+        <w:t xml:space="preserve"> </w:t>
+      </w:r>
+      <w:r>
+        <w:rPr>
           <w:position w:val="-6"/>
         </w:rPr>
         <w:drawing>
@@ -4209,6 +4276,14 @@
       </w:r>
       <w:r>
         <w:rPr>
+          <w:rFonts w:ascii="Times New Roman" w:hAnsi="Times New Roman"/>
+          <w:b w:val="0"/>
+          <w:sz w:val="24"/>
+        </w:rPr>
+        <w:t xml:space="preserve"> </w:t>
+      </w:r>
+      <w:r>
+        <w:rPr>
           <w:position w:val="-6"/>
         </w:rPr>
         <w:drawing>
@@ -4248,9 +4323,9 @@
         <w:rPr>
           <w:rFonts w:ascii="Times New Roman" w:hAnsi="Times New Roman"/>
           <w:b w:val="0"/>
-          <w:sz w:val="23"/>
-        </w:rPr>
-        <w:t>измеримо</w:t>
+          <w:sz w:val="24"/>
+        </w:rPr>
+        <w:t xml:space="preserve"> измеримо</w:t>
       </w:r>
       <w:r>
         <w:rPr>
@@ -4452,9 +4527,9 @@
         <w:rPr>
           <w:rFonts w:ascii="Times New Roman" w:hAnsi="Times New Roman"/>
           <w:b w:val="0"/>
-          <w:sz w:val="23"/>
-        </w:rPr>
-        <w:t>и</w:t>
+          <w:sz w:val="24"/>
+        </w:rPr>
+        <w:t xml:space="preserve"> и</w:t>
       </w:r>
       <w:r>
         <w:rPr>
@@ -4622,6 +4697,14 @@
       </w:r>
       <w:r>
         <w:rPr>
+          <w:rFonts w:ascii="Times New Roman" w:hAnsi="Times New Roman"/>
+          <w:b w:val="0"/>
+          <w:sz w:val="24"/>
+        </w:rPr>
+        <w:t xml:space="preserve"> </w:t>
+      </w:r>
+      <w:r>
+        <w:rPr>
           <w:position w:val="-6"/>
         </w:rPr>
         <w:drawing>
@@ -4964,6 +5047,14 @@
       </w:r>
       <w:r>
         <w:rPr>
+          <w:rFonts w:ascii="Times New Roman" w:hAnsi="Times New Roman"/>
+          <w:b w:val="0"/>
+          <w:sz w:val="24"/>
+        </w:rPr>
+        <w:t xml:space="preserve"> </w:t>
+      </w:r>
+      <w:r>
+        <w:rPr>
           <w:position w:val="-6"/>
         </w:rPr>
         <w:drawing>
@@ -5003,9 +5094,9 @@
         <w:rPr>
           <w:rFonts w:ascii="Times New Roman" w:hAnsi="Times New Roman"/>
           <w:b w:val="0"/>
-          <w:sz w:val="23"/>
-        </w:rPr>
-        <w:t>и</w:t>
+          <w:sz w:val="24"/>
+        </w:rPr>
+        <w:t xml:space="preserve"> и</w:t>
       </w:r>
       <w:r>
         <w:rPr>
@@ -5022,6 +5113,14 @@
           <w:sz w:val="24"/>
         </w:rPr>
         <w:t xml:space="preserve"> множество</w:t>
+      </w:r>
+      <w:r>
+        <w:rPr>
+          <w:rFonts w:ascii="Times New Roman" w:hAnsi="Times New Roman"/>
+          <w:b w:val="0"/>
+          <w:sz w:val="24"/>
+        </w:rPr>
+        <w:t xml:space="preserve"> </w:t>
       </w:r>
       <w:r>
         <w:rPr>
@@ -5064,9 +5163,9 @@
         <w:rPr>
           <w:rFonts w:ascii="Times New Roman" w:hAnsi="Times New Roman"/>
           <w:b w:val="0"/>
-          <w:sz w:val="23"/>
-        </w:rPr>
-        <w:t>такие,</w:t>
+          <w:sz w:val="24"/>
+        </w:rPr>
+        <w:t xml:space="preserve"> такие,</w:t>
       </w:r>
       <w:r>
         <w:rPr>
@@ -5075,6 +5174,14 @@
           <w:sz w:val="24"/>
         </w:rPr>
         <w:t xml:space="preserve"> что</w:t>
+      </w:r>
+      <w:r>
+        <w:rPr>
+          <w:rFonts w:ascii="Times New Roman" w:hAnsi="Times New Roman"/>
+          <w:b w:val="0"/>
+          <w:sz w:val="24"/>
+        </w:rPr>
+        <w:t xml:space="preserve"> </w:t>
       </w:r>
       <w:r>
         <w:rPr>
@@ -5819,6 +5926,14 @@
       </w:r>
       <w:r>
         <w:rPr>
+          <w:rFonts w:ascii="Times New Roman" w:hAnsi="Times New Roman"/>
+          <w:b w:val="0"/>
+          <w:sz w:val="24"/>
+        </w:rPr>
+        <w:t xml:space="preserve"> </w:t>
+      </w:r>
+      <w:r>
+        <w:rPr>
           <w:position w:val="-9"/>
         </w:rPr>
         <w:drawing>
@@ -5858,9 +5973,9 @@
         <w:rPr>
           <w:rFonts w:ascii="Times New Roman" w:hAnsi="Times New Roman"/>
           <w:b w:val="0"/>
-          <w:sz w:val="24"/>
-        </w:rPr>
-        <w:t xml:space="preserve"> е</w:t>
+          <w:sz w:val="23"/>
+        </w:rPr>
+        <w:t>е</w:t>
       </w:r>
       <w:r>
         <w:rPr>
@@ -5977,9 +6092,9 @@
         <w:rPr>
           <w:rFonts w:ascii="Times New Roman" w:hAnsi="Times New Roman"/>
           <w:b w:val="0"/>
-          <w:sz w:val="23"/>
-        </w:rPr>
-        <w:t>—</w:t>
+          <w:sz w:val="24"/>
+        </w:rPr>
+        <w:t xml:space="preserve"> —</w:t>
       </w:r>
       <w:r>
         <w:rPr>
@@ -6119,6 +6234,14 @@
           <w:sz w:val="23"/>
         </w:rPr>
         <w:t>меру</w:t>
+      </w:r>
+      <w:r>
+        <w:rPr>
+          <w:rFonts w:ascii="Times New Roman" w:hAnsi="Times New Roman"/>
+          <w:b w:val="0"/>
+          <w:sz w:val="24"/>
+        </w:rPr>
+        <w:t xml:space="preserve"> </w:t>
       </w:r>
       <w:r>
         <w:rPr>
@@ -6162,7 +6285,8 @@
       <w:pPr>
         <w:pStyle w:val="Heading2"/>
         <w:keepNext/>
-        <w:ind w:left="1032"/>
+        <w:ind w:left="0"/>
+        <w:jc w:val="center"/>
       </w:pPr>
       <w:r>
         <w:rPr>
@@ -6289,7 +6413,8 @@
       <w:pPr>
         <w:pStyle w:val="Heading2"/>
         <w:keepNext/>
-        <w:ind w:left="1300"/>
+        <w:ind w:left="0"/>
+        <w:jc w:val="center"/>
       </w:pPr>
       <w:r>
         <w:rPr>
@@ -6649,6 +6774,14 @@
       </w:r>
       <w:r>
         <w:rPr>
+          <w:rFonts w:ascii="Times New Roman" w:hAnsi="Times New Roman"/>
+          <w:b w:val="0"/>
+          <w:sz w:val="24"/>
+        </w:rPr>
+        <w:t xml:space="preserve"> </w:t>
+      </w:r>
+      <w:r>
+        <w:rPr>
           <w:position w:val="-6"/>
         </w:rPr>
         <w:drawing>
@@ -6688,9 +6821,9 @@
         <w:rPr>
           <w:rFonts w:ascii="Times New Roman" w:hAnsi="Times New Roman"/>
           <w:b w:val="0"/>
-          <w:sz w:val="23"/>
-        </w:rPr>
-        <w:t>—</w:t>
+          <w:sz w:val="24"/>
+        </w:rPr>
+        <w:t xml:space="preserve"> —</w:t>
       </w:r>
       <w:r>
         <w:rPr>
@@ -7357,9 +7490,9 @@
         <w:rPr>
           <w:rFonts w:ascii="Times New Roman" w:hAnsi="Times New Roman"/>
           <w:b w:val="0"/>
-          <w:sz w:val="23"/>
-        </w:rPr>
-        <w:t>функция</w:t>
+          <w:sz w:val="24"/>
+        </w:rPr>
+        <w:t xml:space="preserve"> функция</w:t>
       </w:r>
       <w:r>
         <w:rPr>
@@ -8801,7 +8934,8 @@
       <w:pPr>
         <w:pStyle w:val="Heading2"/>
         <w:keepNext/>
-        <w:ind w:left="1300"/>
+        <w:ind w:left="0"/>
+        <w:jc w:val="center"/>
       </w:pPr>
       <w:r>
         <w:rPr>
@@ -8941,6 +9075,14 @@
           <w:sz w:val="23"/>
         </w:rPr>
         <w:t>а)</w:t>
+      </w:r>
+      <w:r>
+        <w:rPr>
+          <w:rFonts w:ascii="Times New Roman" w:hAnsi="Times New Roman"/>
+          <w:b w:val="0"/>
+          <w:sz w:val="24"/>
+        </w:rPr>
+        <w:t xml:space="preserve"> </w:t>
       </w:r>
       <w:r>
         <w:rPr>
@@ -8994,6 +9136,14 @@
       </w:r>
       <w:r>
         <w:rPr>
+          <w:rFonts w:ascii="Times New Roman" w:hAnsi="Times New Roman"/>
+          <w:b w:val="0"/>
+          <w:sz w:val="24"/>
+        </w:rPr>
+        <w:t xml:space="preserve"> </w:t>
+      </w:r>
+      <w:r>
+        <w:rPr>
           <w:position w:val="-11"/>
         </w:rPr>
         <w:drawing>
@@ -9044,6 +9194,14 @@
       </w:r>
       <w:r>
         <w:rPr>
+          <w:rFonts w:ascii="Times New Roman" w:hAnsi="Times New Roman"/>
+          <w:b w:val="0"/>
+          <w:sz w:val="24"/>
+        </w:rPr>
+        <w:t xml:space="preserve"> </w:t>
+      </w:r>
+      <w:r>
+        <w:rPr>
           <w:position w:val="-11"/>
         </w:rPr>
         <w:drawing>
@@ -9093,6 +9251,14 @@
         <w:t>г)</w:t>
       </w:r>
       <w:r>
+        <w:rPr>
+          <w:rFonts w:ascii="Times New Roman" w:hAnsi="Times New Roman"/>
+          <w:b w:val="0"/>
+          <w:sz w:val="24"/>
+        </w:rPr>
+        <w:t xml:space="preserve"> </w:t>
+      </w:r>
+      <w:r>
         <w:drawing>
           <wp:inline xmlns:a="http://schemas.openxmlformats.org/drawingml/2006/main" xmlns:pic="http://schemas.openxmlformats.org/drawingml/2006/picture">
             <wp:extent cx="2020755" cy="423278"/>
@@ -9141,6 +9307,14 @@
       </w:r>
       <w:r>
         <w:rPr>
+          <w:rFonts w:ascii="Times New Roman" w:hAnsi="Times New Roman"/>
+          <w:b w:val="0"/>
+          <w:sz w:val="24"/>
+        </w:rPr>
+        <w:t xml:space="preserve"> </w:t>
+      </w:r>
+      <w:r>
+        <w:rPr>
           <w:position w:val="-12"/>
         </w:rPr>
         <w:drawing>
@@ -9191,6 +9365,14 @@
       </w:r>
       <w:r>
         <w:rPr>
+          <w:rFonts w:ascii="Times New Roman" w:hAnsi="Times New Roman"/>
+          <w:b w:val="0"/>
+          <w:sz w:val="24"/>
+        </w:rPr>
+        <w:t xml:space="preserve"> </w:t>
+      </w:r>
+      <w:r>
+        <w:rPr>
           <w:position w:val="-12"/>
         </w:rPr>
         <w:drawing>
@@ -9235,6 +9417,14 @@
         <w:t xml:space="preserve"> где</w:t>
       </w:r>
       <w:r>
+        <w:rPr>
+          <w:rFonts w:ascii="Times New Roman" w:hAnsi="Times New Roman"/>
+          <w:b w:val="0"/>
+          <w:sz w:val="24"/>
+        </w:rPr>
+        <w:t xml:space="preserve"> </w:t>
+      </w:r>
+      <w:r>
         <w:drawing>
           <wp:inline xmlns:a="http://schemas.openxmlformats.org/drawingml/2006/main" xmlns:pic="http://schemas.openxmlformats.org/drawingml/2006/picture">
             <wp:extent cx="1815496" cy="923802"/>
@@ -9314,9 +9504,9 @@
         <w:rPr>
           <w:rFonts w:ascii="Times New Roman" w:hAnsi="Times New Roman"/>
           <w:b w:val="0"/>
-          <w:sz w:val="23"/>
-        </w:rPr>
-        <w:t>—</w:t>
+          <w:sz w:val="24"/>
+        </w:rPr>
+        <w:t xml:space="preserve"> —</w:t>
       </w:r>
       <w:r>
         <w:rPr>
@@ -9383,6 +9573,14 @@
           <w:sz w:val="23"/>
         </w:rPr>
         <w:t>а)</w:t>
+      </w:r>
+      <w:r>
+        <w:rPr>
+          <w:rFonts w:ascii="Times New Roman" w:hAnsi="Times New Roman"/>
+          <w:b w:val="0"/>
+          <w:sz w:val="24"/>
+        </w:rPr>
+        <w:t xml:space="preserve"> </w:t>
       </w:r>
       <w:r>
         <w:rPr>
@@ -9494,6 +9692,14 @@
       </w:r>
       <w:r>
         <w:rPr>
+          <w:rFonts w:ascii="Times New Roman" w:hAnsi="Times New Roman"/>
+          <w:b w:val="0"/>
+          <w:sz w:val="24"/>
+        </w:rPr>
+        <w:t xml:space="preserve"> </w:t>
+      </w:r>
+      <w:r>
+        <w:rPr>
           <w:position w:val="-11"/>
         </w:rPr>
         <w:drawing>
@@ -9544,6 +9750,14 @@
       </w:r>
       <w:r>
         <w:rPr>
+          <w:rFonts w:ascii="Times New Roman" w:hAnsi="Times New Roman"/>
+          <w:b w:val="0"/>
+          <w:sz w:val="24"/>
+        </w:rPr>
+        <w:t xml:space="preserve"> </w:t>
+      </w:r>
+      <w:r>
+        <w:rPr>
           <w:position w:val="-11"/>
         </w:rPr>
         <w:drawing>
@@ -9594,6 +9808,14 @@
       </w:r>
       <w:r>
         <w:rPr>
+          <w:rFonts w:ascii="Times New Roman" w:hAnsi="Times New Roman"/>
+          <w:b w:val="0"/>
+          <w:sz w:val="24"/>
+        </w:rPr>
+        <w:t xml:space="preserve"> </w:t>
+      </w:r>
+      <w:r>
+        <w:rPr>
           <w:position w:val="-11"/>
         </w:rPr>
         <w:drawing>
@@ -9644,6 +9866,14 @@
       </w:r>
       <w:r>
         <w:rPr>
+          <w:rFonts w:ascii="Times New Roman" w:hAnsi="Times New Roman"/>
+          <w:b w:val="0"/>
+          <w:sz w:val="24"/>
+        </w:rPr>
+        <w:t xml:space="preserve"> </w:t>
+      </w:r>
+      <w:r>
+        <w:rPr>
           <w:position w:val="-11"/>
         </w:rPr>
         <w:drawing>
@@ -9736,9 +9966,9 @@
         <w:rPr>
           <w:rFonts w:ascii="Times New Roman" w:hAnsi="Times New Roman"/>
           <w:b w:val="0"/>
-          <w:sz w:val="23"/>
-        </w:rPr>
-        <w:t>—</w:t>
+          <w:sz w:val="24"/>
+        </w:rPr>
+        <w:t xml:space="preserve"> —</w:t>
       </w:r>
       <w:r>
         <w:rPr>
@@ -9805,9 +10035,9 @@
         <w:rPr>
           <w:rFonts w:ascii="Times New Roman" w:hAnsi="Times New Roman"/>
           <w:b w:val="0"/>
-          <w:sz w:val="23"/>
-        </w:rPr>
-        <w:t>—</w:t>
+          <w:sz w:val="24"/>
+        </w:rPr>
+        <w:t xml:space="preserve"> —</w:t>
       </w:r>
       <w:r>
         <w:rPr>
@@ -10092,6 +10322,14 @@
         <w:t>в)</w:t>
       </w:r>
       <w:r>
+        <w:rPr>
+          <w:rFonts w:ascii="Times New Roman" w:hAnsi="Times New Roman"/>
+          <w:b w:val="0"/>
+          <w:sz w:val="24"/>
+        </w:rPr>
+        <w:t xml:space="preserve"> </w:t>
+      </w:r>
+      <w:r>
         <w:drawing>
           <wp:inline xmlns:a="http://schemas.openxmlformats.org/drawingml/2006/main" xmlns:pic="http://schemas.openxmlformats.org/drawingml/2006/picture">
             <wp:extent cx="1105194" cy="404697"/>
@@ -10285,6 +10523,14 @@
       </w:r>
       <w:r>
         <w:rPr>
+          <w:rFonts w:ascii="Times New Roman" w:hAnsi="Times New Roman"/>
+          <w:b w:val="0"/>
+          <w:sz w:val="24"/>
+        </w:rPr>
+        <w:t xml:space="preserve"> </w:t>
+      </w:r>
+      <w:r>
+        <w:rPr>
           <w:position w:val="-11"/>
         </w:rPr>
         <w:drawing>
@@ -10393,6 +10639,14 @@
       </w:r>
       <w:r>
         <w:rPr>
+          <w:rFonts w:ascii="Times New Roman" w:hAnsi="Times New Roman"/>
+          <w:b w:val="0"/>
+          <w:sz w:val="24"/>
+        </w:rPr>
+        <w:t xml:space="preserve"> </w:t>
+      </w:r>
+      <w:r>
+        <w:rPr>
           <w:position w:val="-12"/>
         </w:rPr>
         <w:drawing>
@@ -10451,6 +10705,14 @@
       </w:r>
       <w:r>
         <w:rPr>
+          <w:rFonts w:ascii="Times New Roman" w:hAnsi="Times New Roman"/>
+          <w:b w:val="0"/>
+          <w:sz w:val="24"/>
+        </w:rPr>
+        <w:t xml:space="preserve"> </w:t>
+      </w:r>
+      <w:r>
+        <w:rPr>
           <w:position w:val="-7"/>
         </w:rPr>
         <w:drawing>
@@ -10490,9 +10752,9 @@
         <w:rPr>
           <w:rFonts w:ascii="Times New Roman" w:hAnsi="Times New Roman"/>
           <w:b w:val="0"/>
-          <w:sz w:val="23"/>
-        </w:rPr>
-        <w:t>функция</w:t>
+          <w:sz w:val="24"/>
+        </w:rPr>
+        <w:t xml:space="preserve"> функция</w:t>
       </w:r>
       <w:r>
         <w:rPr>
@@ -10501,6 +10763,14 @@
           <w:sz w:val="24"/>
         </w:rPr>
         <w:t xml:space="preserve"> из</w:t>
+      </w:r>
+      <w:r>
+        <w:rPr>
+          <w:rFonts w:ascii="Times New Roman" w:hAnsi="Times New Roman"/>
+          <w:b w:val="0"/>
+          <w:sz w:val="24"/>
+        </w:rPr>
+        <w:t xml:space="preserve"> </w:t>
       </w:r>
       <w:r>
         <w:rPr>
@@ -10543,9 +10813,17 @@
         <w:rPr>
           <w:rFonts w:ascii="Times New Roman" w:hAnsi="Times New Roman"/>
           <w:b w:val="0"/>
-          <w:sz w:val="23"/>
-        </w:rPr>
-        <w:t>в</w:t>
+          <w:sz w:val="24"/>
+        </w:rPr>
+        <w:t xml:space="preserve"> в</w:t>
+      </w:r>
+      <w:r>
+        <w:rPr>
+          <w:rFonts w:ascii="Times New Roman" w:hAnsi="Times New Roman"/>
+          <w:b w:val="0"/>
+          <w:sz w:val="24"/>
+        </w:rPr>
+        <w:t xml:space="preserve"> </w:t>
       </w:r>
       <w:r>
         <w:rPr>
@@ -10610,6 +10888,14 @@
       </w:r>
       <w:r>
         <w:rPr>
+          <w:rFonts w:ascii="Times New Roman" w:hAnsi="Times New Roman"/>
+          <w:b w:val="0"/>
+          <w:sz w:val="24"/>
+        </w:rPr>
+        <w:t xml:space="preserve"> </w:t>
+      </w:r>
+      <w:r>
+        <w:rPr>
           <w:position w:val="-7"/>
         </w:rPr>
         <w:drawing>
@@ -10649,9 +10935,9 @@
         <w:rPr>
           <w:rFonts w:ascii="Times New Roman" w:hAnsi="Times New Roman"/>
           <w:b w:val="0"/>
-          <w:sz w:val="23"/>
-        </w:rPr>
-        <w:t>непрерывны,</w:t>
+          <w:sz w:val="24"/>
+        </w:rPr>
+        <w:t xml:space="preserve"> непрерывны,</w:t>
       </w:r>
       <w:r>
         <w:rPr>
@@ -10715,9 +11001,9 @@
         <w:rPr>
           <w:rFonts w:ascii="Times New Roman" w:hAnsi="Times New Roman"/>
           <w:b w:val="0"/>
-          <w:sz w:val="23"/>
-        </w:rPr>
-        <w:t>интегрируемы</w:t>
+          <w:sz w:val="24"/>
+        </w:rPr>
+        <w:t xml:space="preserve"> интегрируемы</w:t>
       </w:r>
       <w:r>
         <w:rPr>
@@ -10734,6 +11020,14 @@
           <w:sz w:val="24"/>
         </w:rPr>
         <w:t xml:space="preserve"> мере</w:t>
+      </w:r>
+      <w:r>
+        <w:rPr>
+          <w:rFonts w:ascii="Times New Roman" w:hAnsi="Times New Roman"/>
+          <w:b w:val="0"/>
+          <w:sz w:val="24"/>
+        </w:rPr>
+        <w:t xml:space="preserve"> </w:t>
       </w:r>
       <w:r>
         <w:rPr>
@@ -10776,9 +11070,9 @@
         <w:rPr>
           <w:rFonts w:ascii="Times New Roman" w:hAnsi="Times New Roman"/>
           <w:b w:val="0"/>
-          <w:sz w:val="24"/>
-        </w:rPr>
-        <w:t xml:space="preserve"> при</w:t>
+          <w:sz w:val="23"/>
+        </w:rPr>
+        <w:t>при</w:t>
       </w:r>
       <w:r>
         <w:rPr>
@@ -10787,6 +11081,14 @@
           <w:sz w:val="24"/>
         </w:rPr>
         <w:t xml:space="preserve"> этом</w:t>
+      </w:r>
+      <w:r>
+        <w:rPr>
+          <w:rFonts w:ascii="Times New Roman" w:hAnsi="Times New Roman"/>
+          <w:b w:val="0"/>
+          <w:sz w:val="24"/>
+        </w:rPr>
+        <w:t xml:space="preserve"> </w:t>
       </w:r>
       <w:r>
         <w:rPr>
@@ -10835,6 +11137,14 @@
       </w:r>
       <w:r>
         <w:rPr>
+          <w:rFonts w:ascii="Times New Roman" w:hAnsi="Times New Roman"/>
+          <w:b w:val="0"/>
+          <w:sz w:val="24"/>
+        </w:rPr>
+        <w:t xml:space="preserve"> </w:t>
+      </w:r>
+      <w:r>
+        <w:rPr>
           <w:position w:val="-6"/>
         </w:rPr>
         <w:drawing>
@@ -10874,9 +11184,9 @@
         <w:rPr>
           <w:rFonts w:ascii="Times New Roman" w:hAnsi="Times New Roman"/>
           <w:b w:val="0"/>
-          <w:sz w:val="23"/>
-        </w:rPr>
-        <w:t>—</w:t>
+          <w:sz w:val="24"/>
+        </w:rPr>
+        <w:t xml:space="preserve"> —</w:t>
       </w:r>
       <w:r>
         <w:rPr>
@@ -11055,6 +11365,14 @@
       </w:r>
       <w:r>
         <w:rPr>
+          <w:rFonts w:ascii="Times New Roman" w:hAnsi="Times New Roman"/>
+          <w:b w:val="0"/>
+          <w:sz w:val="24"/>
+        </w:rPr>
+        <w:t xml:space="preserve"> </w:t>
+      </w:r>
+      <w:r>
+        <w:rPr>
           <w:position w:val="-9"/>
         </w:rPr>
         <w:drawing>
@@ -11094,9 +11412,9 @@
         <w:rPr>
           <w:rFonts w:ascii="Times New Roman" w:hAnsi="Times New Roman"/>
           <w:b w:val="0"/>
-          <w:sz w:val="23"/>
-        </w:rPr>
-        <w:t>такая,</w:t>
+          <w:sz w:val="24"/>
+        </w:rPr>
+        <w:t xml:space="preserve"> такая,</w:t>
       </w:r>
       <w:r>
         <w:rPr>
@@ -11105,6 +11423,14 @@
           <w:sz w:val="24"/>
         </w:rPr>
         <w:t xml:space="preserve"> что</w:t>
+      </w:r>
+      <w:r>
+        <w:rPr>
+          <w:rFonts w:ascii="Times New Roman" w:hAnsi="Times New Roman"/>
+          <w:b w:val="0"/>
+          <w:sz w:val="24"/>
+        </w:rPr>
+        <w:t xml:space="preserve"> </w:t>
       </w:r>
       <w:r>
         <w:drawing>
@@ -11736,7 +12062,8 @@
       <w:pPr>
         <w:pStyle w:val="Heading2"/>
         <w:keepNext/>
-        <w:ind w:left="1300"/>
+        <w:ind w:left="0"/>
+        <w:jc w:val="center"/>
       </w:pPr>
       <w:r>
         <w:rPr>
@@ -11815,7 +12142,8 @@
       <w:pPr>
         <w:pStyle w:val="Heading2"/>
         <w:keepNext/>
-        <w:ind w:left="674"/>
+        <w:ind w:left="0"/>
+        <w:jc w:val="center"/>
       </w:pPr>
       <w:r>
         <w:rPr>
@@ -12169,6 +12497,14 @@
           <w:sz w:val="24"/>
         </w:rPr>
         <w:t xml:space="preserve"> пространств</w:t>
+      </w:r>
+      <w:r>
+        <w:rPr>
+          <w:rFonts w:ascii="Times New Roman" w:hAnsi="Times New Roman"/>
+          <w:b w:val="0"/>
+          <w:sz w:val="24"/>
+        </w:rPr>
+        <w:t xml:space="preserve"> </w:t>
       </w:r>
       <w:r>
         <w:rPr>
@@ -12523,6 +12859,14 @@
       </w:r>
       <w:r>
         <w:rPr>
+          <w:rFonts w:ascii="Times New Roman" w:hAnsi="Times New Roman"/>
+          <w:b w:val="0"/>
+          <w:sz w:val="24"/>
+        </w:rPr>
+        <w:t xml:space="preserve"> </w:t>
+      </w:r>
+      <w:r>
+        <w:rPr>
           <w:position w:val="-7"/>
         </w:rPr>
         <w:drawing>
@@ -12562,9 +12906,9 @@
         <w:rPr>
           <w:rFonts w:ascii="Times New Roman" w:hAnsi="Times New Roman"/>
           <w:b w:val="0"/>
-          <w:sz w:val="23"/>
-        </w:rPr>
-        <w:t>являются</w:t>
+          <w:sz w:val="24"/>
+        </w:rPr>
+        <w:t xml:space="preserve"> являются</w:t>
       </w:r>
       <w:r>
         <w:rPr>
@@ -12626,6 +12970,14 @@
           <w:sz w:val="24"/>
         </w:rPr>
         <w:t xml:space="preserve"> пространство</w:t>
+      </w:r>
+      <w:r>
+        <w:rPr>
+          <w:rFonts w:ascii="Times New Roman" w:hAnsi="Times New Roman"/>
+          <w:b w:val="0"/>
+          <w:sz w:val="24"/>
+        </w:rPr>
+        <w:t xml:space="preserve"> </w:t>
       </w:r>
       <w:r>
         <w:rPr>
@@ -12890,6 +13242,14 @@
       </w:r>
       <w:r>
         <w:rPr>
+          <w:rFonts w:ascii="Times New Roman" w:hAnsi="Times New Roman"/>
+          <w:b w:val="0"/>
+          <w:sz w:val="24"/>
+        </w:rPr>
+        <w:t xml:space="preserve"> </w:t>
+      </w:r>
+      <w:r>
+        <w:rPr>
           <w:position w:val="-7"/>
         </w:rPr>
         <w:drawing>
@@ -13044,7 +13404,8 @@
       <w:pPr>
         <w:pStyle w:val="Heading2"/>
         <w:keepNext/>
-        <w:ind w:left="891"/>
+        <w:ind w:left="0"/>
+        <w:jc w:val="center"/>
       </w:pPr>
       <w:r>
         <w:rPr>
@@ -13171,7 +13532,8 @@
       <w:pPr>
         <w:pStyle w:val="Heading2"/>
         <w:keepNext/>
-        <w:ind w:left="1300"/>
+        <w:ind w:left="0"/>
+        <w:jc w:val="center"/>
       </w:pPr>
       <w:r>
         <w:rPr>
@@ -13268,9 +13630,9 @@
         <w:rPr>
           <w:rFonts w:ascii="Times New Roman" w:hAnsi="Times New Roman"/>
           <w:b w:val="0"/>
-          <w:sz w:val="23"/>
-        </w:rPr>
-        <w:t>—</w:t>
+          <w:sz w:val="24"/>
+        </w:rPr>
+        <w:t xml:space="preserve"> —</w:t>
       </w:r>
       <w:r>
         <w:rPr>
@@ -14499,9 +14861,9 @@
         <w:rPr>
           <w:rFonts w:ascii="Times New Roman" w:hAnsi="Times New Roman"/>
           <w:b w:val="0"/>
-          <w:sz w:val="23"/>
-        </w:rPr>
-        <w:t>является</w:t>
+          <w:sz w:val="24"/>
+        </w:rPr>
+        <w:t xml:space="preserve"> является</w:t>
       </w:r>
     </w:p>
     <w:p>
@@ -15325,7 +15687,8 @@
       <w:pPr>
         <w:pStyle w:val="Heading2"/>
         <w:keepNext/>
-        <w:ind w:left="1300"/>
+        <w:ind w:left="0"/>
+        <w:jc w:val="center"/>
       </w:pPr>
       <w:r>
         <w:rPr>
@@ -16052,9 +16415,9 @@
         <w:rPr>
           <w:rFonts w:ascii="Times New Roman" w:hAnsi="Times New Roman"/>
           <w:b w:val="0"/>
-          <w:sz w:val="23"/>
-        </w:rPr>
-        <w:t>на</w:t>
+          <w:sz w:val="24"/>
+        </w:rPr>
+        <w:t xml:space="preserve"> на</w:t>
       </w:r>
       <w:r>
         <w:rPr>
@@ -17098,7 +17461,8 @@
       <w:pPr>
         <w:pStyle w:val="Heading2"/>
         <w:keepNext/>
-        <w:ind w:left="1300"/>
+        <w:ind w:left="0"/>
+        <w:jc w:val="center"/>
       </w:pPr>
       <w:r>
         <w:rPr>
@@ -17983,9 +18347,9 @@
         <w:rPr>
           <w:rFonts w:ascii="Times New Roman" w:hAnsi="Times New Roman"/>
           <w:b w:val="0"/>
-          <w:sz w:val="23"/>
-        </w:rPr>
-        <w:t>dt;</w:t>
+          <w:sz w:val="24"/>
+        </w:rPr>
+        <w:t xml:space="preserve"> dt;</w:t>
       </w:r>
     </w:p>
     <w:p>
@@ -18118,6 +18482,14 @@
       </w:r>
       <w:r>
         <w:rPr>
+          <w:rFonts w:ascii="Times New Roman" w:hAnsi="Times New Roman"/>
+          <w:b w:val="0"/>
+          <w:sz w:val="24"/>
+        </w:rPr>
+        <w:t xml:space="preserve"> </w:t>
+      </w:r>
+      <w:r>
+        <w:rPr>
           <w:position w:val="-6"/>
         </w:rPr>
         <w:drawing>
@@ -18321,9 +18693,9 @@
         <w:rPr>
           <w:rFonts w:ascii="Times New Roman" w:hAnsi="Times New Roman"/>
           <w:b w:val="0"/>
-          <w:sz w:val="23"/>
-        </w:rPr>
-        <w:t>—</w:t>
+          <w:sz w:val="24"/>
+        </w:rPr>
+        <w:t xml:space="preserve"> —</w:t>
       </w:r>
       <w:r>
         <w:rPr>
@@ -18483,6 +18855,14 @@
       </w:r>
       <w:r>
         <w:rPr>
+          <w:rFonts w:ascii="Times New Roman" w:hAnsi="Times New Roman"/>
+          <w:b w:val="0"/>
+          <w:sz w:val="24"/>
+        </w:rPr>
+        <w:t xml:space="preserve"> </w:t>
+      </w:r>
+      <w:r>
+        <w:rPr>
           <w:position w:val="-5"/>
         </w:rPr>
         <w:drawing>
@@ -18552,7 +18932,8 @@
       <w:pPr>
         <w:pStyle w:val="Heading2"/>
         <w:keepNext/>
-        <w:ind w:left="1300"/>
+        <w:ind w:left="0"/>
+        <w:jc w:val="center"/>
       </w:pPr>
       <w:r>
         <w:rPr>
@@ -18843,6 +19224,14 @@
       </w:r>
       <w:r>
         <w:rPr>
+          <w:rFonts w:ascii="Times New Roman" w:hAnsi="Times New Roman"/>
+          <w:b w:val="0"/>
+          <w:sz w:val="24"/>
+        </w:rPr>
+        <w:t xml:space="preserve"> </w:t>
+      </w:r>
+      <w:r>
+        <w:rPr>
           <w:position w:val="-12"/>
         </w:rPr>
         <w:drawing>
@@ -18946,6 +19335,14 @@
       </w:r>
       <w:r>
         <w:rPr>
+          <w:rFonts w:ascii="Times New Roman" w:hAnsi="Times New Roman"/>
+          <w:b w:val="0"/>
+          <w:sz w:val="24"/>
+        </w:rPr>
+        <w:t xml:space="preserve"> </w:t>
+      </w:r>
+      <w:r>
+        <w:rPr>
           <w:position w:val="-7"/>
         </w:rPr>
         <w:drawing>
@@ -19151,6 +19548,14 @@
       </w:r>
       <w:r>
         <w:rPr>
+          <w:rFonts w:ascii="Times New Roman" w:hAnsi="Times New Roman"/>
+          <w:b w:val="0"/>
+          <w:sz w:val="24"/>
+        </w:rPr>
+        <w:t xml:space="preserve"> </w:t>
+      </w:r>
+      <w:r>
+        <w:rPr>
           <w:position w:val="-11"/>
         </w:rPr>
         <w:drawing>
@@ -19444,6 +19849,14 @@
       </w:r>
       <w:r>
         <w:rPr>
+          <w:rFonts w:ascii="Times New Roman" w:hAnsi="Times New Roman"/>
+          <w:b w:val="0"/>
+          <w:sz w:val="24"/>
+        </w:rPr>
+        <w:t xml:space="preserve"> </w:t>
+      </w:r>
+      <w:r>
+        <w:rPr>
           <w:position w:val="-5"/>
         </w:rPr>
         <w:drawing>
@@ -19815,6 +20228,14 @@
       </w:r>
       <w:r>
         <w:rPr>
+          <w:rFonts w:ascii="Times New Roman" w:hAnsi="Times New Roman"/>
+          <w:b w:val="0"/>
+          <w:sz w:val="24"/>
+        </w:rPr>
+        <w:t xml:space="preserve"> </w:t>
+      </w:r>
+      <w:r>
+        <w:rPr>
           <w:position w:val="-6"/>
         </w:rPr>
         <w:drawing>
@@ -19989,6 +20410,14 @@
       </w:r>
       <w:r>
         <w:rPr>
+          <w:rFonts w:ascii="Times New Roman" w:hAnsi="Times New Roman"/>
+          <w:b w:val="0"/>
+          <w:sz w:val="24"/>
+        </w:rPr>
+        <w:t xml:space="preserve"> </w:t>
+      </w:r>
+      <w:r>
+        <w:rPr>
           <w:position w:val="-7"/>
         </w:rPr>
         <w:drawing>
@@ -20095,7 +20524,8 @@
       <w:pPr>
         <w:pStyle w:val="Heading2"/>
         <w:keepNext/>
-        <w:ind w:left="550"/>
+        <w:ind w:left="0"/>
+        <w:jc w:val="center"/>
       </w:pPr>
       <w:r>
         <w:rPr>
@@ -20333,6 +20763,14 @@
           <w:sz w:val="24"/>
         </w:rPr>
         <w:t xml:space="preserve"> последовательности</w:t>
+      </w:r>
+      <w:r>
+        <w:rPr>
+          <w:rFonts w:ascii="Times New Roman" w:hAnsi="Times New Roman"/>
+          <w:b w:val="0"/>
+          <w:sz w:val="24"/>
+        </w:rPr>
+        <w:t xml:space="preserve"> </w:t>
       </w:r>
       <w:r>
         <w:rPr>
@@ -20439,6 +20877,14 @@
       </w:r>
       <w:r>
         <w:rPr>
+          <w:rFonts w:ascii="Times New Roman" w:hAnsi="Times New Roman"/>
+          <w:b w:val="0"/>
+          <w:sz w:val="24"/>
+        </w:rPr>
+        <w:t xml:space="preserve"> </w:t>
+      </w:r>
+      <w:r>
+        <w:rPr>
           <w:position w:val="-8"/>
         </w:rPr>
         <w:drawing>
@@ -20513,6 +20959,14 @@
       </w:r>
       <w:r>
         <w:rPr>
+          <w:rFonts w:ascii="Times New Roman" w:hAnsi="Times New Roman"/>
+          <w:b w:val="0"/>
+          <w:sz w:val="24"/>
+        </w:rPr>
+        <w:t xml:space="preserve"> </w:t>
+      </w:r>
+      <w:r>
+        <w:rPr>
           <w:position w:val="-6"/>
         </w:rPr>
         <w:drawing>
@@ -20697,6 +21151,14 @@
         <w:t>б)</w:t>
       </w:r>
       <w:r>
+        <w:rPr>
+          <w:rFonts w:ascii="Times New Roman" w:hAnsi="Times New Roman"/>
+          <w:b w:val="0"/>
+          <w:sz w:val="24"/>
+        </w:rPr>
+        <w:t xml:space="preserve"> </w:t>
+      </w:r>
+      <w:r>
         <w:drawing>
           <wp:inline xmlns:a="http://schemas.openxmlformats.org/drawingml/2006/main" xmlns:pic="http://schemas.openxmlformats.org/drawingml/2006/picture">
             <wp:extent cx="1791522" cy="366135"/>
@@ -20860,6 +21322,14 @@
         <w:t>д)</w:t>
       </w:r>
       <w:r>
+        <w:rPr>
+          <w:rFonts w:ascii="Times New Roman" w:hAnsi="Times New Roman"/>
+          <w:b w:val="0"/>
+          <w:sz w:val="24"/>
+        </w:rPr>
+        <w:t xml:space="preserve"> </w:t>
+      </w:r>
+      <w:r>
         <w:drawing>
           <wp:inline xmlns:a="http://schemas.openxmlformats.org/drawingml/2006/main" xmlns:pic="http://schemas.openxmlformats.org/drawingml/2006/picture">
             <wp:extent cx="2413435" cy="422841"/>
@@ -20932,6 +21402,14 @@
       </w:r>
       <w:r>
         <w:rPr>
+          <w:rFonts w:ascii="Times New Roman" w:hAnsi="Times New Roman"/>
+          <w:b w:val="0"/>
+          <w:sz w:val="24"/>
+        </w:rPr>
+        <w:t xml:space="preserve"> </w:t>
+      </w:r>
+      <w:r>
+        <w:rPr>
           <w:position w:val="-7"/>
         </w:rPr>
         <w:drawing>
@@ -20971,9 +21449,9 @@
         <w:rPr>
           <w:rFonts w:ascii="Times New Roman" w:hAnsi="Times New Roman"/>
           <w:b w:val="0"/>
-          <w:sz w:val="23"/>
-        </w:rPr>
-        <w:t>сильный</w:t>
+          <w:sz w:val="24"/>
+        </w:rPr>
+        <w:t xml:space="preserve"> сильный</w:t>
       </w:r>
       <w:r>
         <w:rPr>
@@ -22283,7 +22761,8 @@
       <w:pPr>
         <w:pStyle w:val="Heading2"/>
         <w:keepNext/>
-        <w:ind w:left="1300"/>
+        <w:ind w:left="0"/>
+        <w:jc w:val="center"/>
       </w:pPr>
       <w:r>
         <w:rPr>
@@ -22734,9 +23213,9 @@
         <w:rPr>
           <w:rFonts w:ascii="Times New Roman" w:hAnsi="Times New Roman"/>
           <w:b w:val="0"/>
-          <w:sz w:val="24"/>
-        </w:rPr>
-        <w:t xml:space="preserve"> ;</w:t>
+          <w:sz w:val="23"/>
+        </w:rPr>
+        <w:t>;</w:t>
       </w:r>
     </w:p>
     <w:p>
@@ -22801,7 +23280,8 @@
       <w:pPr>
         <w:pStyle w:val="Heading2"/>
         <w:keepNext/>
-        <w:ind w:left="1300"/>
+        <w:ind w:left="0"/>
+        <w:jc w:val="center"/>
       </w:pPr>
       <w:r>
         <w:rPr>
@@ -22950,6 +23430,72 @@
           <w:b w:val="0"/>
           <w:sz w:val="24"/>
         </w:rPr>
+        <w:t xml:space="preserve"> №</w:t>
+      </w:r>
+      <w:r>
+        <w:rPr>
+          <w:rFonts w:ascii="Times New Roman" w:hAnsi="Times New Roman"/>
+          <w:b w:val="0"/>
+          <w:sz w:val="24"/>
+        </w:rPr>
+        <w:t xml:space="preserve"> 11.</w:t>
+      </w:r>
+    </w:p>
+    <w:p>
+      <w:pPr>
+        <w:ind w:left="350"/>
+      </w:pPr>
+      <w:r>
+        <w:rPr>
+          <w:rFonts w:ascii="Times New Roman" w:hAnsi="Times New Roman"/>
+          <w:b/>
+          <w:sz w:val="23"/>
+        </w:rPr>
+        <w:t>2.</w:t>
+      </w:r>
+      <w:r>
+        <w:rPr>
+          <w:rFonts w:ascii="Times New Roman" w:hAnsi="Times New Roman"/>
+          <w:b w:val="0"/>
+          <w:sz w:val="24"/>
+        </w:rPr>
+        <w:t xml:space="preserve"> Найдите</w:t>
+      </w:r>
+      <w:r>
+        <w:rPr>
+          <w:rFonts w:ascii="Times New Roman" w:hAnsi="Times New Roman"/>
+          <w:b w:val="0"/>
+          <w:sz w:val="24"/>
+        </w:rPr>
+        <w:t xml:space="preserve"> спектры</w:t>
+      </w:r>
+      <w:r>
+        <w:rPr>
+          <w:rFonts w:ascii="Times New Roman" w:hAnsi="Times New Roman"/>
+          <w:b w:val="0"/>
+          <w:sz w:val="24"/>
+        </w:rPr>
+        <w:t xml:space="preserve"> операторов:</w:t>
+      </w:r>
+    </w:p>
+    <w:p>
+      <w:pPr>
+        <w:ind w:left="350"/>
+      </w:pPr>
+      <w:r>
+        <w:rPr>
+          <w:rFonts w:ascii="Times New Roman" w:hAnsi="Times New Roman"/>
+          <w:b w:val="0"/>
+          <w:sz w:val="23"/>
+        </w:rPr>
+        <w:t>а)</w:t>
+      </w:r>
+      <w:r>
+        <w:rPr>
+          <w:rFonts w:ascii="Times New Roman" w:hAnsi="Times New Roman"/>
+          <w:b w:val="0"/>
+          <w:sz w:val="24"/>
+        </w:rPr>
         <w:t xml:space="preserve"> </w:t>
       </w:r>
       <w:r>
@@ -22958,7 +23504,7 @@
         </w:rPr>
         <w:drawing>
           <wp:inline xmlns:a="http://schemas.openxmlformats.org/drawingml/2006/main" xmlns:pic="http://schemas.openxmlformats.org/drawingml/2006/picture">
-            <wp:extent cx="394176" cy="189596"/>
+            <wp:extent cx="1346143" cy="189857"/>
             <wp:docPr id="239" name="Picture 239" descr="Формула из PDF, не редактируется"/>
             <wp:cNvGraphicFramePr>
               <a:graphicFrameLocks noChangeAspect="1"/>
@@ -22979,7 +23525,7 @@
                   <pic:spPr>
                     <a:xfrm>
                       <a:off x="0" y="0"/>
-                      <a:ext cx="394176" cy="189596"/>
+                      <a:ext cx="1346143" cy="189857"/>
                     </a:xfrm>
                     <a:prstGeom prst="rect"/>
                   </pic:spPr>
@@ -22989,56 +23535,6 @@
           </wp:inline>
         </w:drawing>
       </w:r>
-    </w:p>
-    <w:p>
-      <w:pPr>
-        <w:ind w:left="350"/>
-      </w:pPr>
-      <w:r>
-        <w:rPr>
-          <w:rFonts w:ascii="Times New Roman" w:hAnsi="Times New Roman"/>
-          <w:b/>
-          <w:sz w:val="23"/>
-        </w:rPr>
-        <w:t>2.</w:t>
-      </w:r>
-      <w:r>
-        <w:rPr>
-          <w:rFonts w:ascii="Times New Roman" w:hAnsi="Times New Roman"/>
-          <w:b w:val="0"/>
-          <w:sz w:val="24"/>
-        </w:rPr>
-        <w:t xml:space="preserve"> Найдите</w:t>
-      </w:r>
-      <w:r>
-        <w:rPr>
-          <w:rFonts w:ascii="Times New Roman" w:hAnsi="Times New Roman"/>
-          <w:b w:val="0"/>
-          <w:sz w:val="24"/>
-        </w:rPr>
-        <w:t xml:space="preserve"> спектры</w:t>
-      </w:r>
-      <w:r>
-        <w:rPr>
-          <w:rFonts w:ascii="Times New Roman" w:hAnsi="Times New Roman"/>
-          <w:b w:val="0"/>
-          <w:sz w:val="24"/>
-        </w:rPr>
-        <w:t xml:space="preserve"> операторов:</w:t>
-      </w:r>
-    </w:p>
-    <w:p>
-      <w:pPr>
-        <w:ind w:left="350"/>
-      </w:pPr>
-      <w:r>
-        <w:rPr>
-          <w:rFonts w:ascii="Times New Roman" w:hAnsi="Times New Roman"/>
-          <w:b w:val="0"/>
-          <w:sz w:val="23"/>
-        </w:rPr>
-        <w:t>а)</w:t>
-      </w:r>
       <w:r>
         <w:rPr>
           <w:rFonts w:ascii="Times New Roman" w:hAnsi="Times New Roman"/>
@@ -23049,11 +23545,11 @@
       </w:r>
       <w:r>
         <w:rPr>
-          <w:position w:val="-7"/>
+          <w:position w:val="-6"/>
         </w:rPr>
         <w:drawing>
           <wp:inline xmlns:a="http://schemas.openxmlformats.org/drawingml/2006/main" xmlns:pic="http://schemas.openxmlformats.org/drawingml/2006/picture">
-            <wp:extent cx="1346143" cy="189857"/>
+            <wp:extent cx="1406305" cy="183529"/>
             <wp:docPr id="240" name="Picture 240" descr="Формула из PDF, не редактируется"/>
             <wp:cNvGraphicFramePr>
               <a:graphicFrameLocks noChangeAspect="1"/>
@@ -23074,7 +23570,7 @@
                   <pic:spPr>
                     <a:xfrm>
                       <a:off x="0" y="0"/>
-                      <a:ext cx="1346143" cy="189857"/>
+                      <a:ext cx="1406305" cy="183529"/>
                     </a:xfrm>
                     <a:prstGeom prst="rect"/>
                   </pic:spPr>
@@ -23084,6 +23580,19 @@
           </wp:inline>
         </w:drawing>
       </w:r>
+    </w:p>
+    <w:p>
+      <w:pPr>
+        <w:ind w:left="350"/>
+      </w:pPr>
+      <w:r>
+        <w:rPr>
+          <w:rFonts w:ascii="Times New Roman" w:hAnsi="Times New Roman"/>
+          <w:b w:val="0"/>
+          <w:sz w:val="23"/>
+        </w:rPr>
+        <w:t>б)</w:t>
+      </w:r>
       <w:r>
         <w:rPr>
           <w:rFonts w:ascii="Times New Roman" w:hAnsi="Times New Roman"/>
@@ -23094,11 +23603,11 @@
       </w:r>
       <w:r>
         <w:rPr>
-          <w:position w:val="-6"/>
+          <w:position w:val="-7"/>
         </w:rPr>
         <w:drawing>
           <wp:inline xmlns:a="http://schemas.openxmlformats.org/drawingml/2006/main" xmlns:pic="http://schemas.openxmlformats.org/drawingml/2006/picture">
-            <wp:extent cx="1406305" cy="183529"/>
+            <wp:extent cx="1577997" cy="191205"/>
             <wp:docPr id="241" name="Picture 241" descr="Формула из PDF, не редактируется"/>
             <wp:cNvGraphicFramePr>
               <a:graphicFrameLocks noChangeAspect="1"/>
@@ -23119,7 +23628,7 @@
                   <pic:spPr>
                     <a:xfrm>
                       <a:off x="0" y="0"/>
-                      <a:ext cx="1406305" cy="183529"/>
+                      <a:ext cx="1577997" cy="191205"/>
                     </a:xfrm>
                     <a:prstGeom prst="rect"/>
                   </pic:spPr>
@@ -23129,19 +23638,6 @@
           </wp:inline>
         </w:drawing>
       </w:r>
-    </w:p>
-    <w:p>
-      <w:pPr>
-        <w:ind w:left="350"/>
-      </w:pPr>
-      <w:r>
-        <w:rPr>
-          <w:rFonts w:ascii="Times New Roman" w:hAnsi="Times New Roman"/>
-          <w:b w:val="0"/>
-          <w:sz w:val="23"/>
-        </w:rPr>
-        <w:t>б)</w:t>
-      </w:r>
       <w:r>
         <w:rPr>
           <w:rFonts w:ascii="Times New Roman" w:hAnsi="Times New Roman"/>
@@ -23156,7 +23652,7 @@
         </w:rPr>
         <w:drawing>
           <wp:inline xmlns:a="http://schemas.openxmlformats.org/drawingml/2006/main" xmlns:pic="http://schemas.openxmlformats.org/drawingml/2006/picture">
-            <wp:extent cx="1577997" cy="191205"/>
+            <wp:extent cx="1434896" cy="200154"/>
             <wp:docPr id="242" name="Picture 242" descr="Формула из PDF, не редактируется"/>
             <wp:cNvGraphicFramePr>
               <a:graphicFrameLocks noChangeAspect="1"/>
@@ -23177,51 +23673,6 @@
                   <pic:spPr>
                     <a:xfrm>
                       <a:off x="0" y="0"/>
-                      <a:ext cx="1577997" cy="191205"/>
-                    </a:xfrm>
-                    <a:prstGeom prst="rect"/>
-                  </pic:spPr>
-                </pic:pic>
-              </a:graphicData>
-            </a:graphic>
-          </wp:inline>
-        </w:drawing>
-      </w:r>
-      <w:r>
-        <w:rPr>
-          <w:rFonts w:ascii="Times New Roman" w:hAnsi="Times New Roman"/>
-          <w:b w:val="0"/>
-          <w:sz w:val="24"/>
-        </w:rPr>
-        <w:t xml:space="preserve"> </w:t>
-      </w:r>
-      <w:r>
-        <w:rPr>
-          <w:position w:val="-7"/>
-        </w:rPr>
-        <w:drawing>
-          <wp:inline xmlns:a="http://schemas.openxmlformats.org/drawingml/2006/main" xmlns:pic="http://schemas.openxmlformats.org/drawingml/2006/picture">
-            <wp:extent cx="1434896" cy="200154"/>
-            <wp:docPr id="243" name="Picture 243" descr="Формула из PDF, не редактируется"/>
-            <wp:cNvGraphicFramePr>
-              <a:graphicFrameLocks noChangeAspect="1"/>
-            </wp:cNvGraphicFramePr>
-            <a:graphic>
-              <a:graphicData uri="http://schemas.openxmlformats.org/drawingml/2006/picture">
-                <pic:pic>
-                  <pic:nvPicPr>
-                    <pic:cNvPr id="0" name="p9-math19.png"/>
-                    <pic:cNvPicPr/>
-                  </pic:nvPicPr>
-                  <pic:blipFill>
-                    <a:blip r:embed="rId248"/>
-                    <a:stretch>
-                      <a:fillRect/>
-                    </a:stretch>
-                  </pic:blipFill>
-                  <pic:spPr>
-                    <a:xfrm>
-                      <a:off x="0" y="0"/>
                       <a:ext cx="1434896" cy="200154"/>
                     </a:xfrm>
                     <a:prstGeom prst="rect"/>
@@ -23237,7 +23688,8 @@
       <w:pPr>
         <w:pStyle w:val="Heading2"/>
         <w:keepNext/>
-        <w:ind w:left="1300"/>
+        <w:ind w:left="0"/>
+        <w:jc w:val="center"/>
       </w:pPr>
       <w:r>
         <w:rPr>
@@ -23257,56 +23709,11 @@
       </w:r>
       <w:r>
         <w:rPr>
-          <w:position w:val="-6"/>
-        </w:rPr>
-        <w:drawing>
-          <wp:inline xmlns:a="http://schemas.openxmlformats.org/drawingml/2006/main" xmlns:pic="http://schemas.openxmlformats.org/drawingml/2006/picture">
-            <wp:extent cx="199721" cy="173271"/>
-            <wp:docPr id="244" name="Picture 244" descr="Формула из PDF, не редактируется"/>
-            <wp:cNvGraphicFramePr>
-              <a:graphicFrameLocks noChangeAspect="1"/>
-            </wp:cNvGraphicFramePr>
-            <a:graphic>
-              <a:graphicData uri="http://schemas.openxmlformats.org/drawingml/2006/picture">
-                <pic:pic>
-                  <pic:nvPicPr>
-                    <pic:cNvPr id="0" name="p9-math20.png"/>
-                    <pic:cNvPicPr/>
-                  </pic:nvPicPr>
-                  <pic:blipFill>
-                    <a:blip r:embed="rId249"/>
-                    <a:stretch>
-                      <a:fillRect/>
-                    </a:stretch>
-                  </pic:blipFill>
-                  <pic:spPr>
-                    <a:xfrm>
-                      <a:off x="0" y="0"/>
-                      <a:ext cx="199721" cy="173271"/>
-                    </a:xfrm>
-                    <a:prstGeom prst="rect"/>
-                  </pic:spPr>
-                </pic:pic>
-              </a:graphicData>
-            </a:graphic>
-          </wp:inline>
-        </w:drawing>
-      </w:r>
-      <w:r>
-        <w:rPr>
-          <w:rFonts w:ascii="Times New Roman" w:hAnsi="Times New Roman"/>
-          <w:b w:val="0"/>
-          <w:sz w:val="24"/>
-        </w:rPr>
-        <w:t xml:space="preserve"> </w:t>
-      </w:r>
-      <w:r>
-        <w:rPr>
           <w:rFonts w:ascii="Times New Roman" w:hAnsi="Times New Roman"/>
           <w:b/>
           <w:sz w:val="23"/>
         </w:rPr>
-        <w:t>15</w:t>
+        <w:t>№</w:t>
       </w:r>
       <w:r>
         <w:rPr>
@@ -23322,7 +23729,7 @@
           <w:b/>
           <w:sz w:val="23"/>
         </w:rPr>
-        <w:t>(контрольная</w:t>
+        <w:t>15</w:t>
       </w:r>
       <w:r>
         <w:rPr>
@@ -23338,11 +23745,27 @@
           <w:b/>
           <w:sz w:val="23"/>
         </w:rPr>
+        <w:t>(контрольная</w:t>
+      </w:r>
+      <w:r>
+        <w:rPr>
+          <w:rFonts w:ascii="Times New Roman" w:hAnsi="Times New Roman"/>
+          <w:b w:val="0"/>
+          <w:sz w:val="24"/>
+        </w:rPr>
+        <w:t xml:space="preserve"> </w:t>
+      </w:r>
+      <w:r>
+        <w:rPr>
+          <w:rFonts w:ascii="Times New Roman" w:hAnsi="Times New Roman"/>
+          <w:b/>
+          <w:sz w:val="23"/>
+        </w:rPr>
         <w:t>работа)</w:t>
       </w:r>
     </w:p>
     <w:sectPr>
-      <w:footerReference w:type="default" r:id="rId250"/>
+      <w:footerReference w:type="default" r:id="rId248"/>
       <w:pgSz w:w="11906" w:h="16838"/>
       <w:pgMar w:top="720" w:right="720" w:bottom="720" w:left="720" w:header="720" w:footer="720" w:gutter="0"/>
       <w:cols w:space="720"/>
@@ -23733,6 +24156,7 @@
     <w:rPr>
       <w:rFonts w:ascii="Times New Roman" w:hAnsi="Times New Roman"/>
       <w:sz w:val="24"/>
+      <w:lang w:val="ru-RU"/>
     </w:rPr>
   </w:style>
   <w:style w:type="paragraph" w:styleId="Header">

</xml_diff>